<commit_message>
Deck round-3 fixes: lenient-EM loses on 3 benchmarks; 4-domain set named (PathVQA/SLAKE/VQA-RAD train splits + Kvasir-VQA); selector script claims narrowed
Co-Authored-By: Claude Opus 5.5 (1M context) <noreply@anthropic.com>
Claude-Session: https://claude.ai/code/session_01DVKWfycnD5G4asxf2wsWTn
</commit_message>
<xml_diff>
--- a/meetings/probe_verifier_report_2026-10-19_script.docx
+++ b/meetings/probe_verifier_report_2026-10-19_script.docx
@@ -403,7 +403,7 @@
         <w:t xml:space="preserve"> </w:t>
       </w:r>
       <w:r>
-        <w:t xml:space="preserve">— Not shown, and probably not as well. The claim is about new questions and images from these 8 benchmarks, each of which contributed labelled training questions. Leaving a benchmark out of training gave no benefit over a probe trained on 4 general domains (pooling slide, Part IV); a new benchmark needs some labelled questions.</w:t>
+        <w:t xml:space="preserve">— Not shown, and probably not as well. The claim is about new questions and images from these 8 benchmarks, each of which contributed labelled training questions. Leaving a benchmark out of training gave no benefit over a probe trained on the four-domain set (the PathVQA, SLAKE and VQA-RAD training splits plus Kvasir-VQA) (pooling slide, Part IV); a new benchmark needs some labelled questions.</w:t>
       </w:r>
     </w:p>
     <w:p>
@@ -3923,7 +3923,7 @@
         <w:t xml:space="preserve"> </w:t>
       </w:r>
       <w:r>
-        <w:t xml:space="preserve">test, plus about six thousand questions from four extra domains.</w:t>
+        <w:t xml:space="preserve">test, plus about six thousand questions from the training splits of PathVQA, SLAKE and VQA-RAD and from Kvasir-VQA.</w:t>
       </w:r>
     </w:p>
     <w:p>
@@ -4704,7 +4704,7 @@
         <w:t xml:space="preserve"> </w:t>
       </w:r>
       <w:r>
-        <w:t xml:space="preserve">thousand questions from four extra domains — about 116 thousand answer rows per fold. Two consequences: the probe learns the training</w:t>
+        <w:t xml:space="preserve">thousand questions from the PathVQA, SLAKE and VQA-RAD training splits and Kvasir-VQA — about 116 thousand answer rows per fold. Two consequences: the probe learns the training</w:t>
       </w:r>
       <w:r>
         <w:t xml:space="preserve"> </w:t>
@@ -5302,7 +5302,7 @@
         <w:t xml:space="preserve"> </w:t>
       </w:r>
       <w:r>
-        <w:t xml:space="preserve">passes’ worth of arithmetic per question, more than the sampling itself. That figure comes from a different measurement setup, so I do</w:t>
+        <w:t xml:space="preserve">passes’ worth of arithmetic per question. That figure comes from a different measurement setup, so I do</w:t>
       </w:r>
       <w:r>
         <w:t xml:space="preserve"> </w:t>
@@ -5499,13 +5499,13 @@
         <w:t xml:space="preserve"> </w:t>
       </w:r>
       <w:r>
-        <w:t xml:space="preserve">wherever it exists. Training a selector holds under both metrics: it beats every training-free way of choosing, it ties a much larger</w:t>
-      </w:r>
-      <w:r>
-        <w:t xml:space="preserve"> </w:t>
-      </w:r>
-      <w:r>
-        <w:t xml:space="preserve">untrained verifier, and against the published selector WED it wins on two benchmarks and ties on the third. Some choices are ties</w:t>
+        <w:t xml:space="preserve">wherever it exists. Training a selector holds under both metrics: it beats majority vote, the answer prior, random and longest pick, and self-verification;</w:t>
+      </w:r>
+      <w:r>
+        <w:t xml:space="preserve"> </w:t>
+      </w:r>
+      <w:r>
+        <w:t xml:space="preserve">it ties a much larger untrained verifier; and against the published selector WED it wins on two benchmarks and ties on the third. Likelihood ranking and USC were not run. Some choices are ties</w:t>
       </w:r>
       <w:r>
         <w:t xml:space="preserve"> </w:t>
@@ -5651,7 +5651,7 @@
         <w:pStyle w:val="BodyText"/>
       </w:pPr>
       <w:r>
-        <w:t xml:space="preserve">Why train anything? Every untrained way of choosing among the samples fails. Majority vote loses to greedy. Random</w:t>
+        <w:t xml:space="preserve">Why train anything? Every untrained way of choosing that we ran on these pools loses to greedy or to the probe. Majority vote loses to greedy. Random</w:t>
       </w:r>
       <w:r>
         <w:t xml:space="preserve"> </w:t>
@@ -6543,7 +6543,7 @@
         <w:t xml:space="preserve"> </w:t>
       </w:r>
       <w:r>
-        <w:t xml:space="preserve">four general domains gains about 0.03; trained on the training halves of all eight benchmarks, about 0.07 — two and a half times as</w:t>
+        <w:t xml:space="preserve">the four-domain set (the PathVQA, SLAKE and VQA-RAD training splits plus Kvasir-VQA) gains about 0.03; trained on the training halves of all eight benchmarks, about 0.07 — two and a half times as</w:t>
       </w:r>
       <w:r>
         <w:t xml:space="preserve"> </w:t>
@@ -6561,7 +6561,7 @@
         <w:t xml:space="preserve"> </w:t>
       </w:r>
       <w:r>
-        <w:t xml:space="preserve">probe. So the claim is about new questions and images from benchmarks we have labels for: a new benchmark needs some labelled</w:t>
+        <w:t xml:space="preserve">probe. On the four benchmarks that have no training split in that set the gap is stark: left out plus 0.003, pooled plus 0.099. So the claim is about new questions and images from benchmarks we have labels for: a new benchmark needs some labelled</w:t>
       </w:r>
       <w:r>
         <w:t xml:space="preserve"> </w:t>
@@ -7220,7 +7220,7 @@
         <w:t xml:space="preserve"> </w:t>
       </w:r>
       <w:r>
-        <w:t xml:space="preserve">judges, and per benchmark it loses on Kvasir and VQA-Med; I will explain why on the next slide.</w:t>
+        <w:t xml:space="preserve">judges, and per benchmark it loses on Kvasir, GEMeX and VQA-Med; I will explain why on the next slide.</w:t>
       </w:r>
     </w:p>
     <w:p>
@@ -8780,7 +8780,7 @@
         <w:t xml:space="preserve"> </w:t>
       </w:r>
       <w:r>
-        <w:t xml:space="preserve">trained on four general domains. Third, it is judge-sensitive: the gains are much larger under the judges than under exact match, and the</w:t>
+        <w:t xml:space="preserve">trained on the four-domain set. Third, it is judge-sensitive: the gains are much larger under the judges than under exact match, and the</w:t>
       </w:r>
       <w:r>
         <w:t xml:space="preserve"> </w:t>
@@ -9102,7 +9102,7 @@
         <w:t xml:space="preserve"> </w:t>
       </w:r>
       <w:r>
-        <w:t xml:space="preserve">without labels from the new benchmark, the leave-one-out result applies — no better than a probe trained on four general domains. The</w:t>
+        <w:t xml:space="preserve">without labels from the new benchmark, the leave-one-out result applies — no better than a probe trained on the four-domain set. The</w:t>
       </w:r>
       <w:r>
         <w:t xml:space="preserve"> </w:t>

</xml_diff>

<commit_message>
Probe-count sweep on the shipped T=0.7 method (9 probes tie 24; several layers > several seeds); cap320-feature tie folded into FINAL_METHOD and the deck
- probe_count_sweep_T07.py: copy of probe_count_sweep.py pointed at the shipped T07 run; reproduces all 36,869
  picks and +0.0798 exactly. 3 layers x 1 seed -0.0062 judge LOSS; x2 -0.0038 LOSS; x3 (9 probes) tie; 9..21 tie
  in every currency; layer 22 alone x8 seeds -0.0054 LOSS.
- FINAL_METHOD §2: probe-count and cap320-feature rows; §4 note on the re-read resolution.
- Deck: 'running' mentions replaced by the cap320 result; why-24 Q&A; gap list and next steps updated.

Co-Authored-By: Claude Opus 5.5 (1M context) <noreply@anthropic.com>
Claude-Session: https://claude.ai/code/session_01DVKWfycnD5G4asxf2wsWTn
</commit_message>
<xml_diff>
--- a/meetings/probe_verifier_report_2026-10-19_script.docx
+++ b/meetings/probe_verifier_report_2026-10-19_script.docx
@@ -12442,7 +12442,7 @@
         </w:numPr>
       </w:pPr>
       <w:r>
-        <w:t xml:space="preserve">For the shipped probe, re-extracting the features at the generation resolution is running now.</w:t>
+        <w:t xml:space="preserve">For the shipped probe, re-extracting the features at the generation resolution and refitting ties in every metric (judge minus 0.0012).</w:t>
       </w:r>
     </w:p>
     <w:bookmarkEnd w:id="315"/>
@@ -14142,7 +14142,7 @@
         </w:numPr>
       </w:pPr>
       <w:r>
-        <w:t xml:space="preserve">The direct test — re-extracting these states at the generation budget — is running now.</w:t>
+        <w:t xml:space="preserve">The direct test — re-extracting these states at the generation budget and refitting — gave a tie in every metric: judge minus 0.0012, interval minus 0.0060 to plus 0.0033.</w:t>
       </w:r>
     </w:p>
     <w:p>
@@ -15324,7 +15324,29 @@
         <w:t xml:space="preserve"> </w:t>
       </w:r>
       <w:r>
-        <w:t xml:space="preserve">— One layer instead of three: −0.0007 (head_final_stack_PVFIXED_2026-09-13.json, pooled_ens − pooled_singlelayer, September). Seeds: an August readout with 2 seeds gave selection efficiency 0.8120 vs 0.8283 with 8 (OPENTEXT_CORRECTIONS_2026-08-19.md §2) — but the same doc shows CPU thread count alone moves that number by up to 0.035, so it is indicative only. A single probe on the final recipe: not measured.</w:t>
+        <w:t xml:space="preserve">— One layer instead of three: −0.0007 (head_final_stack_PVFIXED_2026-09-13.json, pooled_ens − pooled_singlelayer, September). Seeds: an August readout with 2 seeds gave selection efficiency 0.8120 vs 0.8283 with 8 (OPENTEXT_CORRECTIONS_2026-08-19.md §2) — but the same doc shows CPU thread count alone moves that number by up to 0.035, so it is indicative only. Measured since on the final probes (2026-10-22, every subset of the 24 re-scored, no refit; probe_count_sweep_T07_2026-10-22.json): 3 layers × 1 seed −0.0062 judge [−0.0100, −0.0023], a loss under both judges; × 2 seeds −0.0038, a loss; × 3 seeds (9 probes) −0.0025 [−0.0053, +0.0003], a tie, and every count from 9 to 21 ties in every metric. One layer with all 8 seeds: layer 22 −0.0054 (loss), layers 18 / 20 ties. So 24 is more than needed, and several layers matter more than several seeds.</w:t>
+      </w:r>
+    </w:p>
+    <w:p>
+      <w:pPr>
+        <w:pStyle w:val="Compact"/>
+        <w:numPr>
+          <w:ilvl w:val="0"/>
+          <w:numId w:val="1345"/>
+        </w:numPr>
+      </w:pPr>
+      <w:r>
+        <w:rPr>
+          <w:i/>
+          <w:iCs/>
+        </w:rPr>
+        <w:t xml:space="preserve">Why 24 and not 21 or 27?</w:t>
+      </w:r>
+      <w:r>
+        <w:t xml:space="preserve"> </w:t>
+      </w:r>
+      <w:r>
+        <w:t xml:space="preserve">— 24 was not tuned: 3 layers × 8 seeds, the 8 inherited from the August selector. The sweep on the final probes (probe_count_sweep_T07_2026-10-22.json) shows 21 probes (7 seeds per layer) ties 24 (judge −0.0001), and so does anything down to 9 (3 per layer); below that it loses about 0.4–0.6 points under both judges. 27 was not tested, but the curve is flat from 9 upward.</w:t>
       </w:r>
     </w:p>
     <w:p>
@@ -18777,7 +18799,7 @@
         </w:numPr>
       </w:pPr>
       <w:r>
-        <w:t xml:space="preserve">An experiment re-reading everything at the generation budget is running.</w:t>
+        <w:t xml:space="preserve">Re-reading everything at the generation budget and refitting since gave a tie in every metric (judge minus 0.0012).</w:t>
       </w:r>
     </w:p>
     <w:p>
@@ -23135,13 +23157,13 @@
         <w:t xml:space="preserve">Say:</w:t>
       </w:r>
     </w:p>
-    <w:bookmarkStart w:id="546" w:name="running-now"/>
-    <w:p>
-      <w:pPr>
-        <w:pStyle w:val="Heading4"/>
-      </w:pPr>
-      <w:r>
-        <w:t xml:space="preserve">▸ running now</w:t>
+    <w:bookmarkStart w:id="546" w:name="done-since-cap320-features"/>
+    <w:p>
+      <w:pPr>
+        <w:pStyle w:val="Heading4"/>
+      </w:pPr>
+      <w:r>
+        <w:t xml:space="preserve">▸ done since: cap320 features</w:t>
       </w:r>
     </w:p>
     <w:p>
@@ -23153,7 +23175,7 @@
         </w:numPr>
       </w:pPr>
       <w:r>
-        <w:t xml:space="preserve">One experiment is running now.</w:t>
+        <w:t xml:space="preserve">All features were re-extracted at the image budget the answers were generated at, cap320, and the probes refit with the same protocol.</w:t>
       </w:r>
     </w:p>
     <w:p>
@@ -23165,7 +23187,7 @@
         </w:numPr>
       </w:pPr>
       <w:r>
-        <w:t xml:space="preserve">All features have been re-extracted at the same image budget the answers were generated at, cap320.</w:t>
+        <w:t xml:space="preserve">Result: a tie in every metric — judge minus 0.0012, interval minus 0.0060 to plus 0.0033.</w:t>
       </w:r>
     </w:p>
     <w:p>
@@ -23177,19 +23199,7 @@
         </w:numPr>
       </w:pPr>
       <w:r>
-        <w:t xml:space="preserve">The probes are being refit and re-evaluated with the same protocol.</w:t>
-      </w:r>
-    </w:p>
-    <w:p>
-      <w:pPr>
-        <w:pStyle w:val="Compact"/>
-        <w:numPr>
-          <w:ilvl w:val="0"/>
-          <w:numId w:val="1511"/>
-        </w:numPr>
-      </w:pPr>
-      <w:r>
-        <w:t xml:space="preserve">If it holds, the re-read no longer needs the higher-resolution pass, and the WED comparison becomes symmetric in resolution.</w:t>
+        <w:t xml:space="preserve">So the higher-resolution re-read is not what produces the gain; what is still owed is capturing the states inside the sampling pass itself.</w:t>
       </w:r>
     </w:p>
     <w:bookmarkEnd w:id="546"/>

</xml_diff>